<commit_message>
fixed overlay for mobilr
</commit_message>
<xml_diff>
--- a/Jozuna Examora.docx
+++ b/Jozuna Examora.docx
@@ -9,12 +9,37 @@
           <w:bCs/>
         </w:rPr>
       </w:pPr>
-      <w:r>
-        <w:rPr>
-          <w:b/>
-          <w:bCs/>
-        </w:rPr>
-        <w:t>Jozuna Examora: Detailed Technical &amp; Security Report</w:t>
+      <w:proofErr w:type="spellStart"/>
+      <w:r>
+        <w:rPr>
+          <w:b/>
+          <w:bCs/>
+        </w:rPr>
+        <w:t>Jozuna</w:t>
+      </w:r>
+      <w:proofErr w:type="spellEnd"/>
+      <w:r>
+        <w:rPr>
+          <w:b/>
+          <w:bCs/>
+        </w:rPr>
+        <w:t xml:space="preserve"> </w:t>
+      </w:r>
+      <w:proofErr w:type="spellStart"/>
+      <w:r>
+        <w:rPr>
+          <w:b/>
+          <w:bCs/>
+        </w:rPr>
+        <w:t>Examora</w:t>
+      </w:r>
+      <w:proofErr w:type="spellEnd"/>
+      <w:r>
+        <w:rPr>
+          <w:b/>
+          <w:bCs/>
+        </w:rPr>
+        <w:t>: Detailed Technical &amp; Security Report</w:t>
       </w:r>
     </w:p>
     <w:p>
@@ -33,8 +58,21 @@
       </w:r>
     </w:p>
     <w:p>
-      <w:r>
-        <w:t>Jozuna Examora is a high-integrity assessment platform. This report provides a deep-dive into the technical implementation of our "Hardened Security" phase, designed to mitigate 99% of common web-based cheating methods.</w:t>
+      <w:proofErr w:type="spellStart"/>
+      <w:r>
+        <w:t>Jozuna</w:t>
+      </w:r>
+      <w:proofErr w:type="spellEnd"/>
+      <w:r>
+        <w:t xml:space="preserve"> </w:t>
+      </w:r>
+      <w:proofErr w:type="spellStart"/>
+      <w:r>
+        <w:t>Examora</w:t>
+      </w:r>
+      <w:proofErr w:type="spellEnd"/>
+      <w:r>
+        <w:t xml:space="preserve"> is a high-integrity assessment platform. This report provides a deep-dive into the technical implementation of our "Hardened Security" phase, designed to mitigate 99% of common web-based cheating methods.</w:t>
       </w:r>
     </w:p>
     <w:p>
@@ -131,7 +169,33 @@
     </w:p>
     <w:p>
       <w:r>
-        <w:t>We utilize a global keydown and keyup listener with e.preventDefault() to intercept OS-level and browser-level shortcuts.</w:t>
+        <w:t>We utilize a global </w:t>
+      </w:r>
+      <w:proofErr w:type="spellStart"/>
+      <w:r>
+        <w:t>keydown</w:t>
+      </w:r>
+      <w:proofErr w:type="spellEnd"/>
+      <w:r>
+        <w:t> and </w:t>
+      </w:r>
+      <w:proofErr w:type="spellStart"/>
+      <w:r>
+        <w:t>keyup</w:t>
+      </w:r>
+      <w:proofErr w:type="spellEnd"/>
+      <w:r>
+        <w:t> listener with </w:t>
+      </w:r>
+      <w:proofErr w:type="spellStart"/>
+      <w:proofErr w:type="gramStart"/>
+      <w:r>
+        <w:t>e.preventDefault</w:t>
+      </w:r>
+      <w:proofErr w:type="spellEnd"/>
+      <w:proofErr w:type="gramEnd"/>
+      <w:r>
+        <w:t>() to intercept OS-level and browser-level shortcuts.</w:t>
       </w:r>
     </w:p>
     <w:p>
@@ -168,7 +232,15 @@
         <w:t>Operating System Safeguards:</w:t>
       </w:r>
       <w:r>
-        <w:t> Specifically blocks the Windows "Snipping Tool" (Win+Shift+S) and macOS screenshot triggers.</w:t>
+        <w:t> Specifically blocks the Windows "Snipping Tool" (</w:t>
+      </w:r>
+      <w:proofErr w:type="spellStart"/>
+      <w:r>
+        <w:t>Win+Shift+S</w:t>
+      </w:r>
+      <w:proofErr w:type="spellEnd"/>
+      <w:r>
+        <w:t>) and macOS screenshot triggers.</w:t>
       </w:r>
     </w:p>
     <w:p>
@@ -193,40 +265,121 @@
     </w:p>
     <w:p>
       <w:r>
-        <w:t>// Periodic background clear every 5 seconds</w:t>
-      </w:r>
-    </w:p>
-    <w:p>
-      <w:r>
-        <w:t>const interval = setInterval(() =&gt; navigator.clipboard.writeText(' '), 5000);</w:t>
-      </w:r>
-    </w:p>
-    <w:p>
-      <w:pPr>
-        <w:rPr>
-          <w:b/>
-          <w:bCs/>
-        </w:rPr>
-      </w:pPr>
-      <w:r>
-        <w:rPr>
-          <w:b/>
-          <w:bCs/>
-        </w:rPr>
-        <w:t>2. Intelligent Face Detection (MediaPipe)</w:t>
+        <w:t xml:space="preserve">// Periodic background </w:t>
+      </w:r>
+      <w:proofErr w:type="gramStart"/>
+      <w:r>
+        <w:t>clear</w:t>
+      </w:r>
+      <w:proofErr w:type="gramEnd"/>
+      <w:r>
+        <w:t xml:space="preserve"> every 5 seconds</w:t>
+      </w:r>
+    </w:p>
+    <w:p>
+      <w:proofErr w:type="spellStart"/>
+      <w:r>
+        <w:t>const</w:t>
+      </w:r>
+      <w:proofErr w:type="spellEnd"/>
+      <w:r>
+        <w:t xml:space="preserve"> interval = </w:t>
+      </w:r>
+      <w:proofErr w:type="spellStart"/>
+      <w:proofErr w:type="gramStart"/>
+      <w:r>
+        <w:t>setInterval</w:t>
+      </w:r>
+      <w:proofErr w:type="spellEnd"/>
+      <w:r>
+        <w:t>(</w:t>
+      </w:r>
+      <w:proofErr w:type="gramEnd"/>
+      <w:r>
+        <w:t xml:space="preserve">() =&gt; </w:t>
+      </w:r>
+      <w:proofErr w:type="spellStart"/>
+      <w:proofErr w:type="gramStart"/>
+      <w:r>
+        <w:t>navigator.clipboard</w:t>
+      </w:r>
+      <w:proofErr w:type="gramEnd"/>
+      <w:r>
+        <w:t>.</w:t>
+      </w:r>
+      <w:proofErr w:type="gramStart"/>
+      <w:r>
+        <w:t>writeText</w:t>
+      </w:r>
+      <w:proofErr w:type="spellEnd"/>
+      <w:r>
+        <w:t>(</w:t>
+      </w:r>
+      <w:proofErr w:type="gramEnd"/>
+      <w:r>
+        <w:t>' '), 5000);</w:t>
+      </w:r>
+    </w:p>
+    <w:p>
+      <w:pPr>
+        <w:rPr>
+          <w:b/>
+          <w:bCs/>
+        </w:rPr>
+      </w:pPr>
+      <w:r>
+        <w:rPr>
+          <w:b/>
+          <w:bCs/>
+        </w:rPr>
+        <w:t>2. Intelligent Face Detection (</w:t>
+      </w:r>
+      <w:proofErr w:type="spellStart"/>
+      <w:r>
+        <w:rPr>
+          <w:b/>
+          <w:bCs/>
+        </w:rPr>
+        <w:t>MediaPipe</w:t>
+      </w:r>
+      <w:proofErr w:type="spellEnd"/>
+      <w:r>
+        <w:rPr>
+          <w:b/>
+          <w:bCs/>
+        </w:rPr>
+        <w:t>)</w:t>
       </w:r>
     </w:p>
     <w:p>
       <w:r>
         <w:t>Instead of simple motion detection, we use the </w:t>
       </w:r>
-      <w:r>
-        <w:rPr>
-          <w:b/>
-          <w:bCs/>
-        </w:rPr>
-        <w:t>MediaPipe BlazeFace</w:t>
-      </w:r>
+      <w:proofErr w:type="spellStart"/>
+      <w:r>
+        <w:rPr>
+          <w:b/>
+          <w:bCs/>
+        </w:rPr>
+        <w:t>MediaPipe</w:t>
+      </w:r>
+      <w:proofErr w:type="spellEnd"/>
+      <w:r>
+        <w:rPr>
+          <w:b/>
+          <w:bCs/>
+        </w:rPr>
+        <w:t xml:space="preserve"> </w:t>
+      </w:r>
+      <w:proofErr w:type="spellStart"/>
+      <w:r>
+        <w:rPr>
+          <w:b/>
+          <w:bCs/>
+        </w:rPr>
+        <w:t>BlazeFace</w:t>
+      </w:r>
+      <w:proofErr w:type="spellEnd"/>
       <w:r>
         <w:t> machine learning model.</w:t>
       </w:r>
@@ -298,8 +451,26 @@
       </w:r>
     </w:p>
     <w:p>
-      <w:r>
-        <w:t>ScreenRecorder component enforces strict sharing rules via the browser's getSettings() API:</w:t>
+      <w:proofErr w:type="spellStart"/>
+      <w:r>
+        <w:t>ScreenRecorder</w:t>
+      </w:r>
+      <w:proofErr w:type="spellEnd"/>
+      <w:r>
+        <w:t> component enforces strict sharing rules via the browser's </w:t>
+      </w:r>
+      <w:proofErr w:type="spellStart"/>
+      <w:proofErr w:type="gramStart"/>
+      <w:r>
+        <w:t>getSettings</w:t>
+      </w:r>
+      <w:proofErr w:type="spellEnd"/>
+      <w:r>
+        <w:t>(</w:t>
+      </w:r>
+      <w:proofErr w:type="gramEnd"/>
+      <w:r>
+        <w:t>) API:</w:t>
       </w:r>
     </w:p>
     <w:p>
@@ -317,7 +488,15 @@
         <w:t>Constraint:</w:t>
       </w:r>
       <w:r>
-        <w:t> displaySurface === 'monitor'</w:t>
+        <w:t> </w:t>
+      </w:r>
+      <w:proofErr w:type="spellStart"/>
+      <w:r>
+        <w:t>displaySurface</w:t>
+      </w:r>
+      <w:proofErr w:type="spellEnd"/>
+      <w:r>
+        <w:t xml:space="preserve"> === 'monitor'</w:t>
       </w:r>
     </w:p>
     <w:p>
@@ -501,7 +680,15 @@
           </w:tcPr>
           <w:p>
             <w:r>
-              <w:t>Real-time getDisplayMedia stream</w:t>
+              <w:t>Real-time </w:t>
+            </w:r>
+            <w:proofErr w:type="spellStart"/>
+            <w:r>
+              <w:t>getDisplayMedia</w:t>
+            </w:r>
+            <w:proofErr w:type="spellEnd"/>
+            <w:r>
+              <w:t> stream</w:t>
             </w:r>
           </w:p>
         </w:tc>
@@ -571,7 +758,15 @@
           </w:tcPr>
           <w:p>
             <w:r>
-              <w:t>Continuous Opus/WebM recording</w:t>
+              <w:t>Continuous Opus/</w:t>
+            </w:r>
+            <w:proofErr w:type="spellStart"/>
+            <w:r>
+              <w:t>WebM</w:t>
+            </w:r>
+            <w:proofErr w:type="spellEnd"/>
+            <w:r>
+              <w:t xml:space="preserve"> recording</w:t>
             </w:r>
           </w:p>
         </w:tc>
@@ -741,15 +936,29 @@
       </w:r>
     </w:p>
     <w:p>
-      <w:r>
-        <w:t>IndexedDB Integration</w:t>
+      <w:proofErr w:type="spellStart"/>
+      <w:r>
+        <w:t>IndexedDB</w:t>
+      </w:r>
+      <w:proofErr w:type="spellEnd"/>
+      <w:r>
+        <w:t xml:space="preserve"> Integration</w:t>
       </w:r>
     </w:p>
     <w:p>
       <w:r>
         <w:lastRenderedPageBreak/>
-        <w:t>To bypass the 5MB localStorage limit, all proctoring media is stored in </w:t>
-      </w:r>
+        <w:t>To bypass the 5MB </w:t>
+      </w:r>
+      <w:proofErr w:type="spellStart"/>
+      <w:r>
+        <w:t>localStorage</w:t>
+      </w:r>
+      <w:proofErr w:type="spellEnd"/>
+      <w:r>
+        <w:t> limit, all proctoring media is stored in </w:t>
+      </w:r>
+      <w:proofErr w:type="spellStart"/>
       <w:r>
         <w:rPr>
           <w:b/>
@@ -757,6 +966,7 @@
         </w:rPr>
         <w:t>IndexedDB</w:t>
       </w:r>
+      <w:proofErr w:type="spellEnd"/>
       <w:r>
         <w:t>.</w:t>
       </w:r>
@@ -863,7 +1073,31 @@
         <w:t>Managerial Oversight:</w:t>
       </w:r>
       <w:r>
-        <w:t> Every violation is timestamped and categorized (e.g., shortcut_c, print_attempt, tab_switch) for post-exam review.</w:t>
+        <w:t> Every violation is timestamped and categorized (e.g., </w:t>
+      </w:r>
+      <w:proofErr w:type="spellStart"/>
+      <w:r>
+        <w:t>shortcut_c</w:t>
+      </w:r>
+      <w:proofErr w:type="spellEnd"/>
+      <w:r>
+        <w:t>, </w:t>
+      </w:r>
+      <w:proofErr w:type="spellStart"/>
+      <w:r>
+        <w:t>print_attempt</w:t>
+      </w:r>
+      <w:proofErr w:type="spellEnd"/>
+      <w:r>
+        <w:t>, </w:t>
+      </w:r>
+      <w:proofErr w:type="spellStart"/>
+      <w:r>
+        <w:t>tab_switch</w:t>
+      </w:r>
+      <w:proofErr w:type="spellEnd"/>
+      <w:r>
+        <w:t>) for post-exam review.</w:t>
       </w:r>
     </w:p>
     <w:p/>
@@ -896,20 +1130,60 @@
           <w:bCs/>
         </w:rPr>
       </w:pPr>
-      <w:r>
-        <w:rPr>
-          <w:rFonts w:ascii="Segoe UI Emoji" w:hAnsi="Segoe UI Emoji" w:cs="Segoe UI Emoji"/>
-          <w:b/>
-          <w:bCs/>
-        </w:rPr>
-        <w:t>🛡️</w:t>
-      </w:r>
-      <w:r>
-        <w:rPr>
-          <w:b/>
-          <w:bCs/>
-        </w:rPr>
-        <w:t xml:space="preserve"> Examora – Exam Security Features Documentation </w:t>
+      <w:proofErr w:type="spellStart"/>
+      <w:r>
+        <w:rPr>
+          <w:b/>
+          <w:bCs/>
+        </w:rPr>
+        <w:t>Jozuna</w:t>
+      </w:r>
+      <w:proofErr w:type="spellEnd"/>
+      <w:r>
+        <w:rPr>
+          <w:b/>
+          <w:bCs/>
+        </w:rPr>
+        <w:t xml:space="preserve"> </w:t>
+      </w:r>
+      <w:proofErr w:type="spellStart"/>
+      <w:r>
+        <w:rPr>
+          <w:b/>
+          <w:bCs/>
+        </w:rPr>
+        <w:t>Examora</w:t>
+      </w:r>
+      <w:proofErr w:type="spellEnd"/>
+      <w:r>
+        <w:rPr>
+          <w:b/>
+          <w:bCs/>
+        </w:rPr>
+        <w:t xml:space="preserve"> </w:t>
+      </w:r>
+      <w:proofErr w:type="gramStart"/>
+      <w:r>
+        <w:rPr>
+          <w:b/>
+          <w:bCs/>
+        </w:rPr>
+        <w:t xml:space="preserve">- </w:t>
+      </w:r>
+      <w:r>
+        <w:rPr>
+          <w:b/>
+          <w:bCs/>
+        </w:rPr>
+        <w:t xml:space="preserve"> Exam</w:t>
+      </w:r>
+      <w:proofErr w:type="gramEnd"/>
+      <w:r>
+        <w:rPr>
+          <w:b/>
+          <w:bCs/>
+        </w:rPr>
+        <w:t xml:space="preserve"> Security Features Documentation </w:t>
       </w:r>
     </w:p>
     <w:p>
@@ -928,8 +1202,13 @@
       </w:r>
     </w:p>
     <w:p>
-      <w:r>
-        <w:t xml:space="preserve">Examora implements a </w:t>
+      <w:proofErr w:type="spellStart"/>
+      <w:r>
+        <w:t>Examora</w:t>
+      </w:r>
+      <w:proofErr w:type="spellEnd"/>
+      <w:r>
+        <w:t xml:space="preserve"> implements a </w:t>
       </w:r>
       <w:r>
         <w:rPr>
@@ -999,7 +1278,7 @@
     <w:p>
       <w:r>
         <w:pict>
-          <v:rect id="_x0000_i1110" style="width:0;height:1.5pt" o:hralign="center" o:hrstd="t" o:hr="t" fillcolor="#a0a0a0" stroked="f"/>
+          <v:rect id="_x0000_i1026" style="width:0;height:1.5pt" o:hralign="center" o:hrstd="t" o:hr="t" fillcolor="#a0a0a0" stroked="f"/>
         </w:pict>
       </w:r>
     </w:p>
@@ -1020,7 +1299,23 @@
     </w:p>
     <w:p>
       <w:r>
-        <w:t xml:space="preserve">On desktops, the exam enters fullscreen mode when started. If the user exits fullscreen, a </w:t>
+        <w:t xml:space="preserve">On desktops, the exam enters </w:t>
+      </w:r>
+      <w:proofErr w:type="spellStart"/>
+      <w:r>
+        <w:t>fullscreen</w:t>
+      </w:r>
+      <w:proofErr w:type="spellEnd"/>
+      <w:r>
+        <w:t xml:space="preserve"> mode when started. If the user exits </w:t>
+      </w:r>
+      <w:proofErr w:type="spellStart"/>
+      <w:r>
+        <w:t>fullscreen</w:t>
+      </w:r>
+      <w:proofErr w:type="spellEnd"/>
+      <w:r>
+        <w:t xml:space="preserve">, a </w:t>
       </w:r>
       <w:r>
         <w:rPr>
@@ -1030,18 +1325,34 @@
         <w:t>30-second countdown</w:t>
       </w:r>
       <w:r>
-        <w:t xml:space="preserve"> begins, after which the exam is auto-submitted if fullscreen is not restored. During this time, the exam screen is blurred and interactions are disabled.</w:t>
-      </w:r>
-    </w:p>
-    <w:p>
-      <w:r>
-        <w:t>On mobile devices, fullscreen is not enforced due to browser limitations. Instead, other protections such as overlays and monitoring mechanisms are used.</w:t>
+        <w:t xml:space="preserve"> begins, after which the exam is auto-submitted if </w:t>
+      </w:r>
+      <w:proofErr w:type="spellStart"/>
+      <w:r>
+        <w:t>fullscreen</w:t>
+      </w:r>
+      <w:proofErr w:type="spellEnd"/>
+      <w:r>
+        <w:t xml:space="preserve"> is not restored. During this time, the exam screen is blurred and interactions are disabled.</w:t>
+      </w:r>
+    </w:p>
+    <w:p>
+      <w:r>
+        <w:t xml:space="preserve">On mobile devices, </w:t>
+      </w:r>
+      <w:proofErr w:type="spellStart"/>
+      <w:r>
+        <w:t>fullscreen</w:t>
+      </w:r>
+      <w:proofErr w:type="spellEnd"/>
+      <w:r>
+        <w:t xml:space="preserve"> is not enforced due to browser limitations. Instead, other protections such as overlays and monitoring mechanisms are used.</w:t>
       </w:r>
     </w:p>
     <w:p>
       <w:r>
         <w:pict>
-          <v:rect id="_x0000_i1111" style="width:0;height:1.5pt" o:hralign="center" o:hrstd="t" o:hr="t" fillcolor="#a0a0a0" stroked="f"/>
+          <v:rect id="_x0000_i1027" style="width:0;height:1.5pt" o:hralign="center" o:hrstd="t" o:hr="t" fillcolor="#a0a0a0" stroked="f"/>
         </w:pict>
       </w:r>
     </w:p>
@@ -1064,13 +1375,47 @@
       <w:r>
         <w:t xml:space="preserve">All copy, cut, and paste actions are blocked across both desktop and mobile devices. Keyboard shortcuts like </w:t>
       </w:r>
-      <w:r>
-        <w:rPr>
-          <w:b/>
-          <w:bCs/>
-        </w:rPr>
-        <w:t>Ctrl+C, Ctrl+V, and Ctrl+X</w:t>
-      </w:r>
+      <w:proofErr w:type="spellStart"/>
+      <w:r>
+        <w:rPr>
+          <w:b/>
+          <w:bCs/>
+        </w:rPr>
+        <w:t>Ctrl+C</w:t>
+      </w:r>
+      <w:proofErr w:type="spellEnd"/>
+      <w:r>
+        <w:rPr>
+          <w:b/>
+          <w:bCs/>
+        </w:rPr>
+        <w:t xml:space="preserve">, </w:t>
+      </w:r>
+      <w:proofErr w:type="spellStart"/>
+      <w:r>
+        <w:rPr>
+          <w:b/>
+          <w:bCs/>
+        </w:rPr>
+        <w:t>Ctrl+V</w:t>
+      </w:r>
+      <w:proofErr w:type="spellEnd"/>
+      <w:r>
+        <w:rPr>
+          <w:b/>
+          <w:bCs/>
+        </w:rPr>
+        <w:t xml:space="preserve">, and </w:t>
+      </w:r>
+      <w:proofErr w:type="spellStart"/>
+      <w:r>
+        <w:rPr>
+          <w:b/>
+          <w:bCs/>
+        </w:rPr>
+        <w:t>Ctrl+X</w:t>
+      </w:r>
+      <w:proofErr w:type="spellEnd"/>
       <w:r>
         <w:t xml:space="preserve"> are disabled. Any attempt triggers a violation warning.</w:t>
       </w:r>
@@ -1083,7 +1428,7 @@
     <w:p>
       <w:r>
         <w:pict>
-          <v:rect id="_x0000_i1112" style="width:0;height:1.5pt" o:hralign="center" o:hrstd="t" o:hr="t" fillcolor="#a0a0a0" stroked="f"/>
+          <v:rect id="_x0000_i1028" style="width:0;height:1.5pt" o:hralign="center" o:hrstd="t" o:hr="t" fillcolor="#a0a0a0" stroked="f"/>
         </w:pict>
       </w:r>
     </w:p>
@@ -1174,7 +1519,7 @@
     <w:p>
       <w:r>
         <w:pict>
-          <v:rect id="_x0000_i1113" style="width:0;height:1.5pt" o:hralign="center" o:hrstd="t" o:hr="t" fillcolor="#a0a0a0" stroked="f"/>
+          <v:rect id="_x0000_i1029" style="width:0;height:1.5pt" o:hralign="center" o:hrstd="t" o:hr="t" fillcolor="#a0a0a0" stroked="f"/>
         </w:pict>
       </w:r>
     </w:p>
@@ -1229,7 +1574,15 @@
         </w:numPr>
       </w:pPr>
       <w:r>
-        <w:t xml:space="preserve">Developer tools (F12, Ctrl+Shift+I, etc.) </w:t>
+        <w:t xml:space="preserve">Developer tools (F12, </w:t>
+      </w:r>
+      <w:proofErr w:type="spellStart"/>
+      <w:r>
+        <w:t>Ctrl+Shift+I</w:t>
+      </w:r>
+      <w:proofErr w:type="spellEnd"/>
+      <w:r>
+        <w:t xml:space="preserve">, etc.) </w:t>
       </w:r>
     </w:p>
     <w:p>
@@ -1251,7 +1604,7 @@
     <w:p>
       <w:r>
         <w:pict>
-          <v:rect id="_x0000_i1114" style="width:0;height:1.5pt" o:hralign="center" o:hrstd="t" o:hr="t" fillcolor="#a0a0a0" stroked="f"/>
+          <v:rect id="_x0000_i1030" style="width:0;height:1.5pt" o:hralign="center" o:hrstd="t" o:hr="t" fillcolor="#a0a0a0" stroked="f"/>
         </w:pict>
       </w:r>
     </w:p>
@@ -1278,7 +1631,7 @@
     <w:p>
       <w:r>
         <w:pict>
-          <v:rect id="_x0000_i1115" style="width:0;height:1.5pt" o:hralign="center" o:hrstd="t" o:hr="t" fillcolor="#a0a0a0" stroked="f"/>
+          <v:rect id="_x0000_i1031" style="width:0;height:1.5pt" o:hralign="center" o:hrstd="t" o:hr="t" fillcolor="#a0a0a0" stroked="f"/>
         </w:pict>
       </w:r>
     </w:p>
@@ -1327,7 +1680,7 @@
     <w:p>
       <w:r>
         <w:pict>
-          <v:rect id="_x0000_i1116" style="width:0;height:1.5pt" o:hralign="center" o:hrstd="t" o:hr="t" fillcolor="#a0a0a0" stroked="f"/>
+          <v:rect id="_x0000_i1032" style="width:0;height:1.5pt" o:hralign="center" o:hrstd="t" o:hr="t" fillcolor="#a0a0a0" stroked="f"/>
         </w:pict>
       </w:r>
     </w:p>
@@ -1386,7 +1739,7 @@
     <w:p>
       <w:r>
         <w:pict>
-          <v:rect id="_x0000_i1117" style="width:0;height:1.5pt" o:hralign="center" o:hrstd="t" o:hr="t" fillcolor="#a0a0a0" stroked="f"/>
+          <v:rect id="_x0000_i1033" style="width:0;height:1.5pt" o:hralign="center" o:hrstd="t" o:hr="t" fillcolor="#a0a0a0" stroked="f"/>
         </w:pict>
       </w:r>
     </w:p>
@@ -1435,7 +1788,7 @@
     <w:p>
       <w:r>
         <w:pict>
-          <v:rect id="_x0000_i1118" style="width:0;height:1.5pt" o:hralign="center" o:hrstd="t" o:hr="t" fillcolor="#a0a0a0" stroked="f"/>
+          <v:rect id="_x0000_i1034" style="width:0;height:1.5pt" o:hralign="center" o:hrstd="t" o:hr="t" fillcolor="#a0a0a0" stroked="f"/>
         </w:pict>
       </w:r>
     </w:p>
@@ -1462,7 +1815,7 @@
     <w:p>
       <w:r>
         <w:pict>
-          <v:rect id="_x0000_i1119" style="width:0;height:1.5pt" o:hralign="center" o:hrstd="t" o:hr="t" fillcolor="#a0a0a0" stroked="f"/>
+          <v:rect id="_x0000_i1035" style="width:0;height:1.5pt" o:hralign="center" o:hrstd="t" o:hr="t" fillcolor="#a0a0a0" stroked="f"/>
         </w:pict>
       </w:r>
     </w:p>
@@ -1489,7 +1842,7 @@
     <w:p>
       <w:r>
         <w:pict>
-          <v:rect id="_x0000_i1120" style="width:0;height:1.5pt" o:hralign="center" o:hrstd="t" o:hr="t" fillcolor="#a0a0a0" stroked="f"/>
+          <v:rect id="_x0000_i1036" style="width:0;height:1.5pt" o:hralign="center" o:hrstd="t" o:hr="t" fillcolor="#a0a0a0" stroked="f"/>
         </w:pict>
       </w:r>
     </w:p>
@@ -1591,7 +1944,7 @@
     <w:p>
       <w:r>
         <w:pict>
-          <v:rect id="_x0000_i1121" style="width:0;height:1.5pt" o:hralign="center" o:hrstd="t" o:hr="t" fillcolor="#a0a0a0" stroked="f"/>
+          <v:rect id="_x0000_i1037" style="width:0;height:1.5pt" o:hralign="center" o:hrstd="t" o:hr="t" fillcolor="#a0a0a0" stroked="f"/>
         </w:pict>
       </w:r>
     </w:p>
@@ -1656,7 +2009,7 @@
     <w:p>
       <w:r>
         <w:pict>
-          <v:rect id="_x0000_i1122" style="width:0;height:1.5pt" o:hralign="center" o:hrstd="t" o:hr="t" fillcolor="#a0a0a0" stroked="f"/>
+          <v:rect id="_x0000_i1038" style="width:0;height:1.5pt" o:hralign="center" o:hrstd="t" o:hr="t" fillcolor="#a0a0a0" stroked="f"/>
         </w:pict>
       </w:r>
     </w:p>
@@ -1738,7 +2091,7 @@
     <w:p>
       <w:r>
         <w:pict>
-          <v:rect id="_x0000_i1123" style="width:0;height:1.5pt" o:hralign="center" o:hrstd="t" o:hr="t" fillcolor="#a0a0a0" stroked="f"/>
+          <v:rect id="_x0000_i1039" style="width:0;height:1.5pt" o:hralign="center" o:hrstd="t" o:hr="t" fillcolor="#a0a0a0" stroked="f"/>
         </w:pict>
       </w:r>
     </w:p>
@@ -6305,6 +6658,7 @@
   <w:style w:type="character" w:default="1" w:styleId="DefaultParagraphFont">
     <w:name w:val="Default Paragraph Font"/>
     <w:uiPriority w:val="1"/>
+    <w:semiHidden/>
     <w:unhideWhenUsed/>
   </w:style>
   <w:style w:type="table" w:default="1" w:styleId="TableNormal">

</xml_diff>